<commit_message>
DSOA-7: Update SRS based on supervisor feedback
</commit_message>
<xml_diff>
--- a/docs/requirements/DSOA-7_SRS_GitHub_Ready.docx
+++ b/docs/requirements/DSOA-7_SRS_GitHub_Ready.docx
@@ -68,16 +68,7 @@
           <w:iCs w:val="0"/>
           <w:color w:val="auto"/>
         </w:rPr>
-        <w:t xml:space="preserve">7 </w:t>
-      </w:r>
-      <w:r>
-        <w:rPr>
-          <w:rFonts w:ascii="Times New Roman" w:hAnsi="Times New Roman" w:cs="Times New Roman"/>
-          <w:i w:val="0"/>
-          <w:iCs w:val="0"/>
-          <w:color w:val="auto"/>
-        </w:rPr>
-        <w:t xml:space="preserve"> Development</w:t>
+        <w:t>7  Development</w:t>
       </w:r>
       <w:proofErr w:type="gramEnd"/>
       <w:r>
@@ -158,16 +149,7 @@
           <w:sz w:val="24"/>
           <w:szCs w:val="24"/>
         </w:rPr>
-        <w:t xml:space="preserve">1. </w:t>
-      </w:r>
-      <w:r>
-        <w:rPr>
-          <w:rFonts w:ascii="Times New Roman" w:hAnsi="Times New Roman" w:cs="Times New Roman"/>
-          <w:color w:val="auto"/>
-          <w:sz w:val="24"/>
-          <w:szCs w:val="24"/>
-        </w:rPr>
-        <w:t>Introduction</w:t>
+        <w:t>1. Introduction</w:t>
       </w:r>
     </w:p>
     <w:p>
@@ -201,23 +183,7 @@
           <w:sz w:val="24"/>
           <w:szCs w:val="24"/>
         </w:rPr>
-        <w:t>Scope. The proposed application</w:t>
-      </w:r>
-      <w:r>
-        <w:rPr>
-          <w:rFonts w:ascii="Times New Roman" w:hAnsi="Times New Roman" w:cs="Times New Roman"/>
-          <w:sz w:val="24"/>
-          <w:szCs w:val="24"/>
-        </w:rPr>
-        <w:t xml:space="preserve"> includes learner accounts, an initial skills assessment, rule-based lesson recommendations, structured lessons, interactive exercises, and progress tracking. A limited administrator interface supports learning-content management. The first version is a re</w:t>
-      </w:r>
-      <w:r>
-        <w:rPr>
-          <w:rFonts w:ascii="Times New Roman" w:hAnsi="Times New Roman" w:cs="Times New Roman"/>
-          <w:sz w:val="24"/>
-          <w:szCs w:val="24"/>
-        </w:rPr>
-        <w:t>sponsive browser-based application; native mobile apps, live tutoring, and AI-generated recommendations are outside the initial scope.</w:t>
+        <w:t>Scope. The proposed application includes learner accounts, an initial skills assessment, rule-based lesson recommendations, structured lessons, interactive exercises, and progress tracking. A limited administrator interface supports learning-content management. The first version is a responsive browser-based application; native mobile apps, live tutoring, and AI-generated recommendations are outside the initial scope.</w:t>
       </w:r>
     </w:p>
     <w:p>
@@ -234,15 +200,7 @@
           <w:sz w:val="24"/>
           <w:szCs w:val="24"/>
         </w:rPr>
-        <w:t>Planned technology. Angular/TypeScript frontend; Node.js/Express backend; PostgreSQL database. These are project design d</w:t>
-      </w:r>
-      <w:r>
-        <w:rPr>
-          <w:rFonts w:ascii="Times New Roman" w:hAnsi="Times New Roman" w:cs="Times New Roman"/>
-          <w:sz w:val="24"/>
-          <w:szCs w:val="24"/>
-        </w:rPr>
-        <w:t>ecisions, not functional requirements.</w:t>
+        <w:t>Planned technology. Angular/TypeScript frontend; Node.js/Express backend; PostgreSQL database. These are project design decisions, not functional requirements.</w:t>
       </w:r>
     </w:p>
     <w:p>
@@ -283,7 +241,7 @@
         <w:tc>
           <w:tcPr>
             <w:tcW w:w="4968" w:type="dxa"/>
-            <w:shd w:val="clear" w:color="auto" w:fill="EAF0F5"/>
+            <w:shd w:val="clear" w:color="auto" w:fill="FFFFFF" w:themeFill="background1"/>
           </w:tcPr>
           <w:p>
             <w:pPr>
@@ -307,7 +265,7 @@
         <w:tc>
           <w:tcPr>
             <w:tcW w:w="4968" w:type="dxa"/>
-            <w:shd w:val="clear" w:color="auto" w:fill="EAF0F5"/>
+            <w:shd w:val="clear" w:color="auto" w:fill="FFFFFF" w:themeFill="background1"/>
           </w:tcPr>
           <w:p>
             <w:pPr>
@@ -377,15 +335,7 @@
                 <w:sz w:val="24"/>
                 <w:szCs w:val="24"/>
               </w:rPr>
-              <w:t>Simple registration and sign-in; clear onboarding; short instructions; skill-level feedback; accessible lessons and exercises; self-paced lea</w:t>
-            </w:r>
-            <w:r>
-              <w:rPr>
-                <w:rFonts w:ascii="Times New Roman" w:hAnsi="Times New Roman" w:cs="Times New Roman"/>
-                <w:sz w:val="24"/>
-                <w:szCs w:val="24"/>
-              </w:rPr>
-              <w:t>rning; visible progress.</w:t>
+              <w:t>Simple registration and sign-in; clear onboarding; short instructions; skill-level feedback; accessible lessons and exercises; self-paced learning; visible progress.</w:t>
             </w:r>
           </w:p>
         </w:tc>
@@ -458,15 +408,7 @@
           <w:sz w:val="24"/>
           <w:szCs w:val="24"/>
         </w:rPr>
-        <w:t xml:space="preserve">A caregiver may assist a learner informally, but no separate </w:t>
-      </w:r>
-      <w:r>
-        <w:rPr>
-          <w:rFonts w:ascii="Times New Roman" w:hAnsi="Times New Roman" w:cs="Times New Roman"/>
-          <w:sz w:val="24"/>
-          <w:szCs w:val="24"/>
-        </w:rPr>
-        <w:t>caregiver account or access to another person’s records is required for the first release.</w:t>
+        <w:t>A caregiver may assist a learner informally, but no separate caregiver account or access to another person’s records is required for the first release.</w:t>
       </w:r>
     </w:p>
     <w:p>
@@ -507,7 +449,7 @@
         <w:tc>
           <w:tcPr>
             <w:tcW w:w="4968" w:type="dxa"/>
-            <w:shd w:val="clear" w:color="auto" w:fill="EAF0F5"/>
+            <w:shd w:val="clear" w:color="auto" w:fill="FFFFFF" w:themeFill="background1"/>
           </w:tcPr>
           <w:p>
             <w:pPr>
@@ -531,7 +473,7 @@
         <w:tc>
           <w:tcPr>
             <w:tcW w:w="4968" w:type="dxa"/>
-            <w:shd w:val="clear" w:color="auto" w:fill="EAF0F5"/>
+            <w:shd w:val="clear" w:color="auto" w:fill="FFFFFF" w:themeFill="background1"/>
           </w:tcPr>
           <w:p>
             <w:pPr>
@@ -654,15 +596,7 @@
                 <w:sz w:val="24"/>
                 <w:szCs w:val="24"/>
               </w:rPr>
-              <w:t>Imp</w:t>
-            </w:r>
-            <w:r>
-              <w:rPr>
-                <w:rFonts w:ascii="Times New Roman" w:hAnsi="Times New Roman" w:cs="Times New Roman"/>
-                <w:sz w:val="24"/>
-                <w:szCs w:val="24"/>
-              </w:rPr>
-              <w:t>ortant improvement, implemented after critical functionality where feasible.</w:t>
+              <w:t>Important improvement, implemented after critical functionality where feasible.</w:t>
             </w:r>
           </w:p>
         </w:tc>
@@ -804,15 +738,7 @@
           <w:sz w:val="24"/>
           <w:szCs w:val="24"/>
         </w:rPr>
-        <w:t>Acceptance criteria: A l</w:t>
-      </w:r>
-      <w:r>
-        <w:rPr>
-          <w:rFonts w:ascii="Times New Roman" w:hAnsi="Times New Roman" w:cs="Times New Roman"/>
-          <w:sz w:val="24"/>
-          <w:szCs w:val="24"/>
-        </w:rPr>
-        <w:t>earner can register with a valid email and password; missing/invalid fields show clear errors; an email already registered is rejected.</w:t>
+        <w:t>Acceptance criteria: A learner can register with a valid email and password; missing/invalid fields show clear errors; an email already registered is rejected.</w:t>
       </w:r>
     </w:p>
     <w:p>
@@ -868,15 +794,7 @@
           <w:sz w:val="24"/>
           <w:szCs w:val="24"/>
         </w:rPr>
-        <w:t xml:space="preserve">Acceptance criteria: A registered learner can sign in with correct </w:t>
-      </w:r>
-      <w:r>
-        <w:rPr>
-          <w:rFonts w:ascii="Times New Roman" w:hAnsi="Times New Roman" w:cs="Times New Roman"/>
-          <w:sz w:val="24"/>
-          <w:szCs w:val="24"/>
-        </w:rPr>
-        <w:t>credentials, is rejected for incorrect credentials, and can log out; protected pages are inaccessible after logout.</w:t>
+        <w:t>Acceptance criteria: A registered learner can sign in with correct credentials, is rejected for incorrect credentials, and can log out; protected pages are inaccessible after logout.</w:t>
       </w:r>
     </w:p>
     <w:p>
@@ -932,15 +850,7 @@
           <w:sz w:val="24"/>
           <w:szCs w:val="24"/>
         </w:rPr>
-        <w:t xml:space="preserve">Acceptance criteria: A first-time learner can answer a predefined assessment; all answers are </w:t>
-      </w:r>
-      <w:r>
-        <w:rPr>
-          <w:rFonts w:ascii="Times New Roman" w:hAnsi="Times New Roman" w:cs="Times New Roman"/>
-          <w:sz w:val="24"/>
-          <w:szCs w:val="24"/>
-        </w:rPr>
-        <w:t>saved and a skill-level result is displayed after submission.</w:t>
+        <w:t>Acceptance criteria: A first-time learner can answer a predefined assessment; all answers are saved and a skill-level result is displayed after submission.</w:t>
       </w:r>
     </w:p>
     <w:p>
@@ -1035,16 +945,7 @@
           <w:sz w:val="24"/>
           <w:szCs w:val="24"/>
         </w:rPr>
-        <w:t xml:space="preserve"> Person</w:t>
-      </w:r>
-      <w:r>
-        <w:rPr>
-          <w:rFonts w:ascii="Times New Roman" w:hAnsi="Times New Roman" w:cs="Times New Roman"/>
-          <w:color w:val="auto"/>
-          <w:sz w:val="24"/>
-          <w:szCs w:val="24"/>
-        </w:rPr>
-        <w:t>alized recommendations [Must Have]</w:t>
+        <w:t xml:space="preserve"> Personalized recommendations [Must Have]</w:t>
       </w:r>
     </w:p>
     <w:p>
@@ -1117,15 +1018,7 @@
           <w:sz w:val="24"/>
           <w:szCs w:val="24"/>
         </w:rPr>
-        <w:t xml:space="preserve">Acceptance </w:t>
-      </w:r>
-      <w:r>
-        <w:rPr>
-          <w:rFonts w:ascii="Times New Roman" w:hAnsi="Times New Roman" w:cs="Times New Roman"/>
-          <w:sz w:val="24"/>
-          <w:szCs w:val="24"/>
-        </w:rPr>
-        <w:t>criteria: Learners can browse available lessons by topic and open a published lesson; unpublished lessons are not shown to learners.</w:t>
+        <w:t>Acceptance criteria: Learners can browse available lessons by topic and open a published lesson; unpublished lessons are not shown to learners.</w:t>
       </w:r>
     </w:p>
     <w:p>
@@ -1169,8 +1062,12 @@
     </w:p>
     <w:p>
       <w:pPr>
-        <w:rPr>
-          <w:rFonts w:ascii="Times New Roman" w:hAnsi="Times New Roman" w:cs="Times New Roman"/>
+        <w:pStyle w:val="21"/>
+        <w:rPr>
+          <w:rFonts w:ascii="Times New Roman" w:hAnsi="Times New Roman" w:cs="Times New Roman"/>
+          <w:b w:val="0"/>
+          <w:bCs w:val="0"/>
+          <w:color w:val="auto"/>
           <w:sz w:val="24"/>
           <w:szCs w:val="24"/>
         </w:rPr>
@@ -1178,18 +1075,13 @@
       <w:r>
         <w:rPr>
           <w:rFonts w:ascii="Times New Roman" w:hAnsi="Times New Roman" w:cs="Times New Roman"/>
-          <w:sz w:val="24"/>
-          <w:szCs w:val="24"/>
-        </w:rPr>
-        <w:t>Acceptance criteria: Each published lesson displays a title, objectives, or</w:t>
-      </w:r>
-      <w:r>
-        <w:rPr>
-          <w:rFonts w:ascii="Times New Roman" w:hAnsi="Times New Roman" w:cs="Times New Roman"/>
-          <w:sz w:val="24"/>
-          <w:szCs w:val="24"/>
-        </w:rPr>
-        <w:t>dered steps, and navigation to the next/previous step; a learner can reopen and repeat it.</w:t>
+          <w:b w:val="0"/>
+          <w:bCs w:val="0"/>
+          <w:color w:val="auto"/>
+          <w:sz w:val="24"/>
+          <w:szCs w:val="24"/>
+        </w:rPr>
+        <w:t>Acceptance criteria: Each published lesson displays a title, learning objectives, and clear step-by-step instructions. Learners can navigate between steps, reopen completed lessons, and repeat lessons as many times as needed without time restrictions.</w:t>
       </w:r>
     </w:p>
     <w:p>
@@ -1233,8 +1125,12 @@
     </w:p>
     <w:p>
       <w:pPr>
-        <w:rPr>
-          <w:rFonts w:ascii="Times New Roman" w:hAnsi="Times New Roman" w:cs="Times New Roman"/>
+        <w:pStyle w:val="21"/>
+        <w:rPr>
+          <w:rFonts w:ascii="Times New Roman" w:hAnsi="Times New Roman" w:cs="Times New Roman"/>
+          <w:b w:val="0"/>
+          <w:bCs w:val="0"/>
+          <w:color w:val="auto"/>
           <w:sz w:val="24"/>
           <w:szCs w:val="24"/>
         </w:rPr>
@@ -1242,18 +1138,13 @@
       <w:r>
         <w:rPr>
           <w:rFonts w:ascii="Times New Roman" w:hAnsi="Times New Roman" w:cs="Times New Roman"/>
-          <w:sz w:val="24"/>
-          <w:szCs w:val="24"/>
-        </w:rPr>
-        <w:t>Acceptance criteria: A learner can complete an exercise attached to a lesson, submit answers, and receive understandable co</w:t>
-      </w:r>
-      <w:r>
-        <w:rPr>
-          <w:rFonts w:ascii="Times New Roman" w:hAnsi="Times New Roman" w:cs="Times New Roman"/>
-          <w:sz w:val="24"/>
-          <w:szCs w:val="24"/>
-        </w:rPr>
-        <w:t>rrect/incorrect feedback.</w:t>
+          <w:b w:val="0"/>
+          <w:bCs w:val="0"/>
+          <w:color w:val="auto"/>
+          <w:sz w:val="24"/>
+          <w:szCs w:val="24"/>
+        </w:rPr>
+        <w:t>Acceptance criteria: A learner can complete an exercise attached to a lesson, submit answers, and receive clear correct/incorrect feedback. Learners can repeat exercises an unlimited number of times without time restrictions, including after successfully completing them.</w:t>
       </w:r>
     </w:p>
     <w:p>
@@ -1348,16 +1239,7 @@
           <w:sz w:val="24"/>
           <w:szCs w:val="24"/>
         </w:rPr>
-        <w:t xml:space="preserve"> Learning dashboard [Must Have</w:t>
-      </w:r>
-      <w:r>
-        <w:rPr>
-          <w:rFonts w:ascii="Times New Roman" w:hAnsi="Times New Roman" w:cs="Times New Roman"/>
-          <w:color w:val="auto"/>
-          <w:sz w:val="24"/>
-          <w:szCs w:val="24"/>
-        </w:rPr>
-        <w:t>]</w:t>
+        <w:t xml:space="preserve"> Learning dashboard [Must Have]</w:t>
       </w:r>
     </w:p>
     <w:p>
@@ -1430,15 +1312,7 @@
           <w:sz w:val="24"/>
           <w:szCs w:val="24"/>
         </w:rPr>
-        <w:t>Acceptance criteria: An authorized admin</w:t>
-      </w:r>
-      <w:r>
-        <w:rPr>
-          <w:rFonts w:ascii="Times New Roman" w:hAnsi="Times New Roman" w:cs="Times New Roman"/>
-          <w:sz w:val="24"/>
-          <w:szCs w:val="24"/>
-        </w:rPr>
-        <w:t>istrator can create, edit, publish and unpublish lessons and their linked exercises or questions; published changes appear for learners, and unauthorized requests are rejected.</w:t>
+        <w:t>Acceptance criteria: An authorized administrator can create, edit, publish and unpublish lessons and their linked exercises or questions; published changes appear for learners, and unauthorized requests are rejected.</w:t>
       </w:r>
     </w:p>
     <w:p>
@@ -1494,15 +1368,7 @@
           <w:sz w:val="24"/>
           <w:szCs w:val="24"/>
         </w:rPr>
-        <w:t xml:space="preserve">Acceptance criteria: </w:t>
-      </w:r>
-      <w:r>
-        <w:rPr>
-          <w:rFonts w:ascii="Times New Roman" w:hAnsi="Times New Roman" w:cs="Times New Roman"/>
-          <w:sz w:val="24"/>
-          <w:szCs w:val="24"/>
-        </w:rPr>
-        <w:t>Returning learners can open the last unfinished lesson at the last saved step.</w:t>
+        <w:t>Acceptance criteria: Returning learners can open the last unfinished lesson at the last saved step.</w:t>
       </w:r>
     </w:p>
     <w:p>
@@ -1558,15 +1424,7 @@
           <w:sz w:val="24"/>
           <w:szCs w:val="24"/>
         </w:rPr>
-        <w:t>Acceptance criteria: Learners can retake the assessment; new recommendations use the latest completed result while progress records remai</w:t>
-      </w:r>
-      <w:r>
-        <w:rPr>
-          <w:rFonts w:ascii="Times New Roman" w:hAnsi="Times New Roman" w:cs="Times New Roman"/>
-          <w:sz w:val="24"/>
-          <w:szCs w:val="24"/>
-        </w:rPr>
-        <w:t>n intact.</w:t>
+        <w:t>Acceptance criteria: Learners can retake the assessment; new recommendations use the latest completed result while progress records remain intact.</w:t>
       </w:r>
     </w:p>
     <w:p>
@@ -1678,15 +1536,39 @@
           <w:sz w:val="24"/>
           <w:szCs w:val="24"/>
         </w:rPr>
-        <w:t>Acceptance criter</w:t>
+        <w:t>Acceptance criteria: A learner can view a summary of lessons completed and exercise performance; displayed numbers match saved results.</w:t>
       </w:r>
+    </w:p>
+    <w:p>
+      <w:pPr>
+        <w:pStyle w:val="aff8"/>
+        <w:rPr>
+          <w:b/>
+          <w:bCs/>
+          <w:lang w:val="en-US"/>
+        </w:rPr>
+      </w:pPr>
       <w:r>
         <w:rPr>
-          <w:rFonts w:ascii="Times New Roman" w:hAnsi="Times New Roman" w:cs="Times New Roman"/>
-          <w:sz w:val="24"/>
-          <w:szCs w:val="24"/>
-        </w:rPr>
-        <w:t>ia: A learner can view a summary of lessons completed and exercise performance; displayed numbers match saved results.</w:t>
+          <w:b/>
+          <w:bCs/>
+          <w:lang w:val="en-US"/>
+        </w:rPr>
+        <w:t>FR-16 - Voice instructions [Could Have]</w:t>
+      </w:r>
+    </w:p>
+    <w:p>
+      <w:pPr>
+        <w:pStyle w:val="aff8"/>
+        <w:rPr>
+          <w:lang w:val="en-US"/>
+        </w:rPr>
+      </w:pPr>
+      <w:r>
+        <w:rPr>
+          <w:lang w:val="en-US"/>
+        </w:rPr>
+        <w:t>Acceptance criteria: The system may provide optional voice instructions for lesson content and navigation guidance. When available, learners can start, pause, resume, and stop audio playback. Voice instructions do not replace written instructions, and all learning activities remain accessible without audio.</w:t>
       </w:r>
     </w:p>
     <w:p>
@@ -1750,8 +1632,12 @@
     </w:p>
     <w:p>
       <w:pPr>
-        <w:rPr>
-          <w:rFonts w:ascii="Times New Roman" w:hAnsi="Times New Roman" w:cs="Times New Roman"/>
+        <w:pStyle w:val="21"/>
+        <w:rPr>
+          <w:rFonts w:ascii="Times New Roman" w:hAnsi="Times New Roman" w:cs="Times New Roman"/>
+          <w:b w:val="0"/>
+          <w:bCs w:val="0"/>
+          <w:color w:val="auto"/>
           <w:sz w:val="24"/>
           <w:szCs w:val="24"/>
         </w:rPr>
@@ -1759,18 +1645,13 @@
       <w:r>
         <w:rPr>
           <w:rFonts w:ascii="Times New Roman" w:hAnsi="Times New Roman" w:cs="Times New Roman"/>
-          <w:sz w:val="24"/>
-          <w:szCs w:val="24"/>
-        </w:rPr>
-        <w:t xml:space="preserve">Acceptance criteria: Default body text is at least 16 CSS px; </w:t>
-      </w:r>
-      <w:r>
-        <w:rPr>
-          <w:rFonts w:ascii="Times New Roman" w:hAnsi="Times New Roman" w:cs="Times New Roman"/>
-          <w:sz w:val="24"/>
-          <w:szCs w:val="24"/>
-        </w:rPr>
-        <w:t>text can be enlarged to 200% without losing essential content or functions; check primary learning screens.</w:t>
+          <w:b w:val="0"/>
+          <w:bCs w:val="0"/>
+          <w:color w:val="auto"/>
+          <w:sz w:val="24"/>
+          <w:szCs w:val="24"/>
+        </w:rPr>
+        <w:t>Acceptance criteria: Default body text is at least 18 CSS px, and primary navigation buttons have clear and readable labels. Text can be enlarged to 200% without losing essential content or functionality. These requirements are verified on registration, assessment, lesson, and dashboard screens.</w:t>
       </w:r>
     </w:p>
     <w:p>
@@ -1826,15 +1707,7 @@
           <w:sz w:val="24"/>
           <w:szCs w:val="24"/>
         </w:rPr>
-        <w:t>Acceptance criteria: Core learner flows work with keyboard only, show visible focus, and expose programmatic labe</w:t>
-      </w:r>
-      <w:r>
-        <w:rPr>
-          <w:rFonts w:ascii="Times New Roman" w:hAnsi="Times New Roman" w:cs="Times New Roman"/>
-          <w:sz w:val="24"/>
-          <w:szCs w:val="24"/>
-        </w:rPr>
-        <w:t>ls for form controls; automated accessibility checks and manual keyboard testing report no blocking issues.</w:t>
+        <w:t>Acceptance criteria: Core learner flows work with keyboard only, show visible focus, and expose programmatic labels for form controls; automated accessibility checks and manual keyboard testing report no blocking issues.</w:t>
       </w:r>
     </w:p>
     <w:p>
@@ -1890,15 +1763,7 @@
           <w:sz w:val="24"/>
           <w:szCs w:val="24"/>
         </w:rPr>
-        <w:t>Acceptance criteria: Normal text achieves a contrast ratio of at least 4.5:1; error messages identi</w:t>
-      </w:r>
-      <w:r>
-        <w:rPr>
-          <w:rFonts w:ascii="Times New Roman" w:hAnsi="Times New Roman" w:cs="Times New Roman"/>
-          <w:sz w:val="24"/>
-          <w:szCs w:val="24"/>
-        </w:rPr>
-        <w:t>fy the affected field and explain how to correct it.</w:t>
+        <w:t>Acceptance criteria: Normal text achieves a contrast ratio of at least 4.5:1; error messages identify the affected field and explain how to correct it.</w:t>
       </w:r>
     </w:p>
     <w:p>
@@ -1954,15 +1819,7 @@
           <w:sz w:val="24"/>
           <w:szCs w:val="24"/>
         </w:rPr>
-        <w:t>Acceptance criteria: Registration, assessment, lessons and dashboard remain usable at viewport widths 390, 768 and 1280 CSS px with no horizontal scrolling of prima</w:t>
-      </w:r>
-      <w:r>
-        <w:rPr>
-          <w:rFonts w:ascii="Times New Roman" w:hAnsi="Times New Roman" w:cs="Times New Roman"/>
-          <w:sz w:val="24"/>
-          <w:szCs w:val="24"/>
-        </w:rPr>
-        <w:t>ry content.</w:t>
+        <w:t>Acceptance criteria: Registration, assessment, lessons and dashboard remain usable at viewport widths 390, 768 and 1280 CSS px with no horizontal scrolling of primary content.</w:t>
       </w:r>
     </w:p>
     <w:p>
@@ -2038,16 +1895,7 @@
           <w:sz w:val="24"/>
           <w:szCs w:val="24"/>
         </w:rPr>
-        <w:t>NFR-</w:t>
-      </w:r>
-      <w:r>
-        <w:rPr>
-          <w:rFonts w:ascii="Times New Roman" w:hAnsi="Times New Roman" w:cs="Times New Roman"/>
-          <w:color w:val="auto"/>
-          <w:sz w:val="24"/>
-          <w:szCs w:val="24"/>
-        </w:rPr>
-        <w:t xml:space="preserve">06 </w:t>
+        <w:t xml:space="preserve">NFR-06 </w:t>
       </w:r>
       <w:r>
         <w:rPr>
@@ -2083,15 +1931,7 @@
           <w:sz w:val="24"/>
           <w:szCs w:val="24"/>
         </w:rPr>
-        <w:t>Acceptance criteria: Server-side validation rejects invalid payloads and unauthorized administration actions; basic injection and broken-access-control test cases do not expose data or change unauthorized</w:t>
-      </w:r>
-      <w:r>
-        <w:rPr>
-          <w:rFonts w:ascii="Times New Roman" w:hAnsi="Times New Roman" w:cs="Times New Roman"/>
-          <w:sz w:val="24"/>
-          <w:szCs w:val="24"/>
-        </w:rPr>
-        <w:t xml:space="preserve"> records.</w:t>
+        <w:t>Acceptance criteria: Server-side validation rejects invalid payloads and unauthorized administration actions; basic injection and broken-access-control test cases do not expose data or change unauthorized records.</w:t>
       </w:r>
     </w:p>
     <w:p>
@@ -2186,16 +2026,7 @@
           <w:sz w:val="24"/>
           <w:szCs w:val="24"/>
         </w:rPr>
-        <w:t xml:space="preserve"> Data reliability [Mus</w:t>
-      </w:r>
-      <w:r>
-        <w:rPr>
-          <w:rFonts w:ascii="Times New Roman" w:hAnsi="Times New Roman" w:cs="Times New Roman"/>
-          <w:color w:val="auto"/>
-          <w:sz w:val="24"/>
-          <w:szCs w:val="24"/>
-        </w:rPr>
-        <w:t>t Have]</w:t>
+        <w:t xml:space="preserve"> Data reliability [Must Have]</w:t>
       </w:r>
     </w:p>
     <w:p>
@@ -2268,15 +2099,7 @@
           <w:sz w:val="24"/>
           <w:szCs w:val="24"/>
         </w:rPr>
-        <w:t>Acceptance cri</w:t>
-      </w:r>
-      <w:r>
-        <w:rPr>
-          <w:rFonts w:ascii="Times New Roman" w:hAnsi="Times New Roman" w:cs="Times New Roman"/>
-          <w:sz w:val="24"/>
-          <w:szCs w:val="24"/>
-        </w:rPr>
-        <w:t>teria: For a simulated network or server failure, the interface displays a plain-language error and offers retry where safe; no raw stack trace appears to learners.</w:t>
+        <w:t>Acceptance criteria: For a simulated network or server failure, the interface displays a plain-language error and offers retry where safe; no raw stack trace appears to learners.</w:t>
       </w:r>
     </w:p>
     <w:p>
@@ -2332,15 +2155,7 @@
           <w:sz w:val="24"/>
           <w:szCs w:val="24"/>
         </w:rPr>
-        <w:t>Acceptance criteria: Main learner flows pass smoke tes</w:t>
-      </w:r>
-      <w:r>
-        <w:rPr>
-          <w:rFonts w:ascii="Times New Roman" w:hAnsi="Times New Roman" w:cs="Times New Roman"/>
-          <w:sz w:val="24"/>
-          <w:szCs w:val="24"/>
-        </w:rPr>
-        <w:t>ts in the latest stable desktop Chrome, Edge, and Firefox and mobile Chrome or Safari available during testing.</w:t>
+        <w:t>Acceptance criteria: Main learner flows pass smoke tests in the latest stable desktop Chrome, Edge, and Firefox and mobile Chrome or Safari available during testing.</w:t>
       </w:r>
     </w:p>
     <w:p>
@@ -2384,8 +2199,12 @@
     </w:p>
     <w:p>
       <w:pPr>
-        <w:rPr>
-          <w:rFonts w:ascii="Times New Roman" w:hAnsi="Times New Roman" w:cs="Times New Roman"/>
+        <w:pStyle w:val="21"/>
+        <w:rPr>
+          <w:rFonts w:ascii="Times New Roman" w:hAnsi="Times New Roman" w:cs="Times New Roman"/>
+          <w:b w:val="0"/>
+          <w:bCs w:val="0"/>
+          <w:color w:val="auto"/>
           <w:sz w:val="24"/>
           <w:szCs w:val="24"/>
         </w:rPr>
@@ -2393,18 +2212,13 @@
       <w:r>
         <w:rPr>
           <w:rFonts w:ascii="Times New Roman" w:hAnsi="Times New Roman" w:cs="Times New Roman"/>
-          <w:sz w:val="24"/>
-          <w:szCs w:val="24"/>
-        </w:rPr>
-        <w:t>Acceptance criteria: From the learner dashboard, a user can reach lessons and progress in no more than th</w:t>
-      </w:r>
-      <w:r>
-        <w:rPr>
-          <w:rFonts w:ascii="Times New Roman" w:hAnsi="Times New Roman" w:cs="Times New Roman"/>
-          <w:sz w:val="24"/>
-          <w:szCs w:val="24"/>
-        </w:rPr>
-        <w:t>ree navigation actions; every primary page includes a clear return path.</w:t>
+          <w:b w:val="0"/>
+          <w:bCs w:val="0"/>
+          <w:color w:val="auto"/>
+          <w:sz w:val="24"/>
+          <w:szCs w:val="24"/>
+        </w:rPr>
+        <w:t>Acceptance criteria: Primary navigation uses clearly labeled buttons with understandable text such as "Next", "Back", and "Home". From the learner dashboard, users can reach lessons and progress in no more than three navigation actions. Every primary page includes a clear return path, and navigation labels remain consistent throughout the application.</w:t>
       </w:r>
     </w:p>
     <w:p>
@@ -2460,15 +2274,7 @@
           <w:sz w:val="24"/>
           <w:szCs w:val="24"/>
         </w:rPr>
-        <w:t>Acceptance criteria: A documented database backup can be restored in a test environment and validated against a sample set of learner and les</w:t>
-      </w:r>
-      <w:r>
-        <w:rPr>
-          <w:rFonts w:ascii="Times New Roman" w:hAnsi="Times New Roman" w:cs="Times New Roman"/>
-          <w:sz w:val="24"/>
-          <w:szCs w:val="24"/>
-        </w:rPr>
-        <w:t>son records.</w:t>
+        <w:t>Acceptance criteria: A documented database backup can be restored in a test environment and validated against a sample set of learner and lesson records.</w:t>
       </w:r>
     </w:p>
     <w:p>
@@ -2509,7 +2315,7 @@
         <w:tc>
           <w:tcPr>
             <w:tcW w:w="4968" w:type="dxa"/>
-            <w:shd w:val="clear" w:color="auto" w:fill="EAF0F5"/>
+            <w:shd w:val="clear" w:color="auto" w:fill="FFFFFF" w:themeFill="background1"/>
           </w:tcPr>
           <w:p>
             <w:pPr>
@@ -2533,7 +2339,7 @@
         <w:tc>
           <w:tcPr>
             <w:tcW w:w="4968" w:type="dxa"/>
-            <w:shd w:val="clear" w:color="auto" w:fill="EAF0F5"/>
+            <w:shd w:val="clear" w:color="auto" w:fill="FFFFFF" w:themeFill="background1"/>
           </w:tcPr>
           <w:p>
             <w:pPr>
@@ -2868,7 +2674,7 @@
                 <w:sz w:val="24"/>
                 <w:szCs w:val="24"/>
               </w:rPr>
-              <w:t>NFR-01, NFR-02, NFR-03, NFR-04, NFR-11</w:t>
+              <w:t>NFR-01, NFR-02, NFR-03, NFR-04, NFR-11; FR-16</w:t>
             </w:r>
           </w:p>
         </w:tc>
@@ -2899,6 +2705,8 @@
               </w:rPr>
               <w:t>Maintainable learning content</w:t>
             </w:r>
+            <w:bookmarkStart w:id="0" w:name="_GoBack"/>
+            <w:bookmarkEnd w:id="0"/>
           </w:p>
         </w:tc>
         <w:tc>
@@ -2941,15 +2749,7 @@
           <w:sz w:val="24"/>
           <w:szCs w:val="24"/>
         </w:rPr>
-        <w:t>Research alignment note. These needs are consistent with the project proposal and literature-review direction (accessibility, low digital confidence, self-paced learning and practice). This document does not claim speci</w:t>
-      </w:r>
-      <w:r>
-        <w:rPr>
-          <w:rFonts w:ascii="Times New Roman" w:hAnsi="Times New Roman" w:cs="Times New Roman"/>
-          <w:sz w:val="24"/>
-          <w:szCs w:val="24"/>
-        </w:rPr>
-        <w:t>fic survey percentages or completed usability testing; any later survey findings should be incorporated during review.</w:t>
+        <w:t>Research alignment note. These needs are consistent with the project proposal and literature-review direction (accessibility, low digital confidence, self-paced learning and practice). This document does not claim specific survey percentages or completed usability testing; any later survey findings should be incorporated during review.</w:t>
       </w:r>
     </w:p>
     <w:p>
@@ -2986,33 +2786,7 @@
           <w:sz w:val="24"/>
           <w:szCs w:val="24"/>
         </w:rPr>
-        <w:t>Verification approach. Functional requirements will be evaluated with scenario-based tests and API/database asse</w:t>
-      </w:r>
-      <w:r>
-        <w:rPr>
-          <w:rFonts w:ascii="Times New Roman" w:hAnsi="Times New Roman" w:cs="Times New Roman"/>
-          <w:sz w:val="24"/>
-          <w:szCs w:val="24"/>
-        </w:rPr>
-        <w:t>rtions; usability and accessibility with keyboard, zoom, contrast and responsive-layout checks; security with authentication and authorization tests; performance with a reproducible load test. The precise test environment will be recorded in the evaluatio</w:t>
-      </w:r>
-      <w:bookmarkStart w:id="0" w:name="_GoBack"/>
-      <w:bookmarkEnd w:id="0"/>
-      <w:r>
-        <w:rPr>
-          <w:rFonts w:ascii="Times New Roman" w:hAnsi="Times New Roman" w:cs="Times New Roman"/>
-          <w:sz w:val="24"/>
-          <w:szCs w:val="24"/>
-        </w:rPr>
-        <w:t>n</w:t>
-      </w:r>
-      <w:r>
-        <w:rPr>
-          <w:rFonts w:ascii="Times New Roman" w:hAnsi="Times New Roman" w:cs="Times New Roman"/>
-          <w:sz w:val="24"/>
-          <w:szCs w:val="24"/>
-        </w:rPr>
-        <w:t xml:space="preserve"> report.</w:t>
+        <w:t>Verification approach. Functional requirements will be evaluated with scenario-based tests and API/database assertions; usability and accessibility with keyboard, zoom, contrast and responsive-layout checks; security with authentication and authorization tests; performance with a reproducible load test. The precise test environment will be recorded in the evaluation report.</w:t>
       </w:r>
     </w:p>
     <w:sectPr>
@@ -3590,11 +3364,6 @@
     <w:lsdException w:name="Book Title" w:uiPriority="33" w:qFormat="1"/>
     <w:lsdException w:name="Bibliography" w:semiHidden="1" w:uiPriority="37" w:unhideWhenUsed="1"/>
     <w:lsdException w:name="TOC Heading" w:semiHidden="1" w:uiPriority="39" w:unhideWhenUsed="1" w:qFormat="1"/>
-    <w:lsdException w:name="Plain Table 5" w:semiHidden="1" w:unhideWhenUsed="1"/>
-    <w:lsdException w:name="Grid Table Light" w:semiHidden="1" w:unhideWhenUsed="1"/>
-    <w:lsdException w:name="Grid Table 1 Light" w:semiHidden="1" w:unhideWhenUsed="1"/>
-    <w:lsdException w:name="Grid Table 2" w:semiHidden="1" w:unhideWhenUsed="1"/>
-    <w:lsdException w:name="Grid Table 3" w:semiHidden="1" w:unhideWhenUsed="1"/>
     <w:lsdException w:name="Grid Table 4" w:uiPriority="49"/>
     <w:lsdException w:name="Grid Table 5 Dark" w:uiPriority="50"/>
     <w:lsdException w:name="Grid Table 6 Colorful" w:uiPriority="51"/>
@@ -14695,6 +14464,22 @@
         <w:shd w:val="clear" w:color="auto" w:fill="FBCAA2" w:themeFill="accent6" w:themeFillTint="7F"/>
       </w:tcPr>
     </w:tblStylePr>
+  </w:style>
+  <w:style w:type="paragraph" w:styleId="aff8">
+    <w:name w:val="Normal (Web)"/>
+    <w:basedOn w:val="a1"/>
+    <w:uiPriority w:val="99"/>
+    <w:unhideWhenUsed/>
+    <w:rsid w:val="00D57F8A"/>
+    <w:pPr>
+      <w:spacing w:before="100" w:beforeAutospacing="1" w:afterAutospacing="1" w:line="240" w:lineRule="auto"/>
+    </w:pPr>
+    <w:rPr>
+      <w:rFonts w:ascii="Times New Roman" w:eastAsia="Times New Roman" w:hAnsi="Times New Roman" w:cs="Times New Roman"/>
+      <w:sz w:val="24"/>
+      <w:szCs w:val="24"/>
+      <w:lang w:val="ru-RU" w:eastAsia="ru-RU"/>
+    </w:rPr>
   </w:style>
 </w:styles>
 </file>
@@ -15024,7 +14809,7 @@
 </file>
 
 <file path=customXml/itemProps1.xml><?xml version="1.0" encoding="utf-8"?>
-<ds:datastoreItem xmlns:ds="http://schemas.openxmlformats.org/officeDocument/2006/customXml" ds:itemID="{5A2937BE-D702-40AB-8420-D33C56DDCEFD}">
+<ds:datastoreItem xmlns:ds="http://schemas.openxmlformats.org/officeDocument/2006/customXml" ds:itemID="{B336DADF-4F82-4636-9E75-DE46534E1014}">
   <ds:schemaRefs>
     <ds:schemaRef ds:uri="http://schemas.openxmlformats.org/officeDocument/2006/bibliography"/>
   </ds:schemaRefs>

</xml_diff>